<commit_message>
adding Cabled_15, correcting errors in previous summaries
</commit_message>
<xml_diff>
--- a/AT50-29/Cabled-15_AT50-29_Discrete_Summary-README.docx
+++ b/AT50-29/Cabled-15_AT50-29_Discrete_Summary-README.docx
@@ -169,19 +169,7 @@
         <w:rPr>
           <w:rFonts w:asciiTheme="majorHAnsi" w:hAnsiTheme="majorHAnsi" w:cstheme="majorHAnsi"/>
         </w:rPr>
-        <w:t>J2-160</w:t>
-      </w:r>
-      <w:r>
-        <w:rPr>
-          <w:rFonts w:asciiTheme="majorHAnsi" w:hAnsiTheme="majorHAnsi" w:cstheme="majorHAnsi"/>
-        </w:rPr>
-        <w:t>5</w:t>
-      </w:r>
-      <w:r>
-        <w:rPr>
-          <w:rFonts w:asciiTheme="majorHAnsi" w:hAnsiTheme="majorHAnsi" w:cstheme="majorHAnsi"/>
-        </w:rPr>
-        <w:t>_CT2</w:t>
+        <w:t>J2-1605_CT2</w:t>
       </w:r>
       <w:r>
         <w:rPr>
@@ -206,19 +194,7 @@
         <w:rPr>
           <w:rFonts w:asciiTheme="majorHAnsi" w:hAnsiTheme="majorHAnsi" w:cstheme="majorHAnsi"/>
         </w:rPr>
-        <w:t>at50-2900</w:t>
-      </w:r>
-      <w:r>
-        <w:rPr>
-          <w:rFonts w:asciiTheme="majorHAnsi" w:hAnsiTheme="majorHAnsi" w:cstheme="majorHAnsi"/>
-        </w:rPr>
-        <w:t>2</w:t>
-      </w:r>
-      <w:r>
-        <w:rPr>
-          <w:rFonts w:asciiTheme="majorHAnsi" w:hAnsiTheme="majorHAnsi" w:cstheme="majorHAnsi"/>
-        </w:rPr>
-        <w:t xml:space="preserve"> = </w:t>
+        <w:t xml:space="preserve">at50-29002 = </w:t>
       </w:r>
       <w:r>
         <w:rPr>
@@ -237,19 +213,7 @@
         <w:rPr>
           <w:rFonts w:asciiTheme="majorHAnsi" w:hAnsiTheme="majorHAnsi" w:cstheme="majorHAnsi"/>
         </w:rPr>
-        <w:t>at50-2900</w:t>
-      </w:r>
-      <w:r>
-        <w:rPr>
-          <w:rFonts w:asciiTheme="majorHAnsi" w:hAnsiTheme="majorHAnsi" w:cstheme="majorHAnsi"/>
-        </w:rPr>
-        <w:t>3</w:t>
-      </w:r>
-      <w:r>
-        <w:rPr>
-          <w:rFonts w:asciiTheme="majorHAnsi" w:hAnsiTheme="majorHAnsi" w:cstheme="majorHAnsi"/>
-        </w:rPr>
-        <w:t xml:space="preserve"> = </w:t>
+        <w:t xml:space="preserve">at50-29003 = </w:t>
       </w:r>
       <w:r>
         <w:rPr>
@@ -268,19 +232,7 @@
         <w:rPr>
           <w:rFonts w:asciiTheme="majorHAnsi" w:hAnsiTheme="majorHAnsi" w:cstheme="majorHAnsi"/>
         </w:rPr>
-        <w:t>J2-16</w:t>
-      </w:r>
-      <w:r>
-        <w:rPr>
-          <w:rFonts w:asciiTheme="majorHAnsi" w:hAnsiTheme="majorHAnsi" w:cstheme="majorHAnsi"/>
-        </w:rPr>
-        <w:t>1</w:t>
-      </w:r>
-      <w:r>
-        <w:rPr>
-          <w:rFonts w:asciiTheme="majorHAnsi" w:hAnsiTheme="majorHAnsi" w:cstheme="majorHAnsi"/>
-        </w:rPr>
-        <w:t>2_CT2</w:t>
+        <w:t>J2-1612_CT2</w:t>
       </w:r>
       <w:r>
         <w:rPr>
@@ -305,19 +257,7 @@
         <w:rPr>
           <w:rFonts w:asciiTheme="majorHAnsi" w:hAnsiTheme="majorHAnsi" w:cstheme="majorHAnsi"/>
         </w:rPr>
-        <w:t>at50-2900</w:t>
-      </w:r>
-      <w:r>
-        <w:rPr>
-          <w:rFonts w:asciiTheme="majorHAnsi" w:hAnsiTheme="majorHAnsi" w:cstheme="majorHAnsi"/>
-        </w:rPr>
-        <w:t>4</w:t>
-      </w:r>
-      <w:r>
-        <w:rPr>
-          <w:rFonts w:asciiTheme="majorHAnsi" w:hAnsiTheme="majorHAnsi" w:cstheme="majorHAnsi"/>
-        </w:rPr>
-        <w:t xml:space="preserve"> = </w:t>
+        <w:t xml:space="preserve">at50-29004 = </w:t>
       </w:r>
       <w:r>
         <w:rPr>
@@ -336,19 +276,7 @@
         <w:rPr>
           <w:rFonts w:asciiTheme="majorHAnsi" w:hAnsiTheme="majorHAnsi" w:cstheme="majorHAnsi"/>
         </w:rPr>
-        <w:t>J2-16</w:t>
-      </w:r>
-      <w:r>
-        <w:rPr>
-          <w:rFonts w:asciiTheme="majorHAnsi" w:hAnsiTheme="majorHAnsi" w:cstheme="majorHAnsi"/>
-        </w:rPr>
-        <w:t>17</w:t>
-      </w:r>
-      <w:r>
-        <w:rPr>
-          <w:rFonts w:asciiTheme="majorHAnsi" w:hAnsiTheme="majorHAnsi" w:cstheme="majorHAnsi"/>
-        </w:rPr>
-        <w:t>_CT2</w:t>
+        <w:t>J2-1617_CT2</w:t>
       </w:r>
       <w:r>
         <w:rPr>
@@ -373,19 +301,7 @@
         <w:rPr>
           <w:rFonts w:asciiTheme="majorHAnsi" w:hAnsiTheme="majorHAnsi" w:cstheme="majorHAnsi"/>
         </w:rPr>
-        <w:t>J2-16</w:t>
-      </w:r>
-      <w:r>
-        <w:rPr>
-          <w:rFonts w:asciiTheme="majorHAnsi" w:hAnsiTheme="majorHAnsi" w:cstheme="majorHAnsi"/>
-        </w:rPr>
-        <w:t>19</w:t>
-      </w:r>
-      <w:r>
-        <w:rPr>
-          <w:rFonts w:asciiTheme="majorHAnsi" w:hAnsiTheme="majorHAnsi" w:cstheme="majorHAnsi"/>
-        </w:rPr>
-        <w:t>_CT2</w:t>
+        <w:t>J2-1619_CT2</w:t>
       </w:r>
       <w:r>
         <w:rPr>
@@ -410,19 +326,7 @@
         <w:rPr>
           <w:rFonts w:asciiTheme="majorHAnsi" w:hAnsiTheme="majorHAnsi" w:cstheme="majorHAnsi"/>
         </w:rPr>
-        <w:t>J2-16</w:t>
-      </w:r>
-      <w:r>
-        <w:rPr>
-          <w:rFonts w:asciiTheme="majorHAnsi" w:hAnsiTheme="majorHAnsi" w:cstheme="majorHAnsi"/>
-        </w:rPr>
-        <w:t>21</w:t>
-      </w:r>
-      <w:r>
-        <w:rPr>
-          <w:rFonts w:asciiTheme="majorHAnsi" w:hAnsiTheme="majorHAnsi" w:cstheme="majorHAnsi"/>
-        </w:rPr>
-        <w:t>_CT2</w:t>
+        <w:t>J2-1621_CT2</w:t>
       </w:r>
       <w:r>
         <w:rPr>
@@ -447,19 +351,7 @@
         <w:rPr>
           <w:rFonts w:asciiTheme="majorHAnsi" w:hAnsiTheme="majorHAnsi" w:cstheme="majorHAnsi"/>
         </w:rPr>
-        <w:t>J2-16</w:t>
-      </w:r>
-      <w:r>
-        <w:rPr>
-          <w:rFonts w:asciiTheme="majorHAnsi" w:hAnsiTheme="majorHAnsi" w:cstheme="majorHAnsi"/>
-        </w:rPr>
-        <w:t>23</w:t>
-      </w:r>
-      <w:r>
-        <w:rPr>
-          <w:rFonts w:asciiTheme="majorHAnsi" w:hAnsiTheme="majorHAnsi" w:cstheme="majorHAnsi"/>
-        </w:rPr>
-        <w:t>_CT2</w:t>
+        <w:t>J2-1623_CT2</w:t>
       </w:r>
       <w:r>
         <w:rPr>
@@ -490,19 +382,7 @@
         <w:rPr>
           <w:rFonts w:asciiTheme="majorHAnsi" w:hAnsiTheme="majorHAnsi" w:cstheme="majorHAnsi"/>
         </w:rPr>
-        <w:t>J2-16</w:t>
-      </w:r>
-      <w:r>
-        <w:rPr>
-          <w:rFonts w:asciiTheme="majorHAnsi" w:hAnsiTheme="majorHAnsi" w:cstheme="majorHAnsi"/>
-        </w:rPr>
-        <w:t>29</w:t>
-      </w:r>
-      <w:r>
-        <w:rPr>
-          <w:rFonts w:asciiTheme="majorHAnsi" w:hAnsiTheme="majorHAnsi" w:cstheme="majorHAnsi"/>
-        </w:rPr>
-        <w:t>_CT2</w:t>
+        <w:t>J2-1629_CT2</w:t>
       </w:r>
       <w:r>
         <w:rPr>
@@ -527,19 +407,7 @@
         <w:rPr>
           <w:rFonts w:asciiTheme="majorHAnsi" w:hAnsiTheme="majorHAnsi" w:cstheme="majorHAnsi"/>
         </w:rPr>
-        <w:t>at50-2900</w:t>
-      </w:r>
-      <w:r>
-        <w:rPr>
-          <w:rFonts w:asciiTheme="majorHAnsi" w:hAnsiTheme="majorHAnsi" w:cstheme="majorHAnsi"/>
-        </w:rPr>
-        <w:t>5</w:t>
-      </w:r>
-      <w:r>
-        <w:rPr>
-          <w:rFonts w:asciiTheme="majorHAnsi" w:hAnsiTheme="majorHAnsi" w:cstheme="majorHAnsi"/>
-        </w:rPr>
-        <w:t xml:space="preserve"> = </w:t>
+        <w:t xml:space="preserve">at50-29005 = </w:t>
       </w:r>
       <w:r>
         <w:rPr>
@@ -558,19 +426,7 @@
         <w:rPr>
           <w:rFonts w:asciiTheme="majorHAnsi" w:hAnsiTheme="majorHAnsi" w:cstheme="majorHAnsi"/>
         </w:rPr>
-        <w:t>at50-2900</w:t>
-      </w:r>
-      <w:r>
-        <w:rPr>
-          <w:rFonts w:asciiTheme="majorHAnsi" w:hAnsiTheme="majorHAnsi" w:cstheme="majorHAnsi"/>
-        </w:rPr>
-        <w:t>6</w:t>
-      </w:r>
-      <w:r>
-        <w:rPr>
-          <w:rFonts w:asciiTheme="majorHAnsi" w:hAnsiTheme="majorHAnsi" w:cstheme="majorHAnsi"/>
-        </w:rPr>
-        <w:t xml:space="preserve"> = </w:t>
+        <w:t xml:space="preserve">at50-29006 = </w:t>
       </w:r>
       <w:r>
         <w:rPr>
@@ -589,19 +445,7 @@
         <w:rPr>
           <w:rFonts w:asciiTheme="majorHAnsi" w:hAnsiTheme="majorHAnsi" w:cstheme="majorHAnsi"/>
         </w:rPr>
-        <w:t>at50-2900</w:t>
-      </w:r>
-      <w:r>
-        <w:rPr>
-          <w:rFonts w:asciiTheme="majorHAnsi" w:hAnsiTheme="majorHAnsi" w:cstheme="majorHAnsi"/>
-        </w:rPr>
-        <w:t>7</w:t>
-      </w:r>
-      <w:r>
-        <w:rPr>
-          <w:rFonts w:asciiTheme="majorHAnsi" w:hAnsiTheme="majorHAnsi" w:cstheme="majorHAnsi"/>
-        </w:rPr>
-        <w:t xml:space="preserve"> = </w:t>
+        <w:t xml:space="preserve">at50-29007 = </w:t>
       </w:r>
       <w:r>
         <w:rPr>
@@ -620,19 +464,7 @@
         <w:rPr>
           <w:rFonts w:asciiTheme="majorHAnsi" w:hAnsiTheme="majorHAnsi" w:cstheme="majorHAnsi"/>
         </w:rPr>
-        <w:t>J2-16</w:t>
-      </w:r>
-      <w:r>
-        <w:rPr>
-          <w:rFonts w:asciiTheme="majorHAnsi" w:hAnsiTheme="majorHAnsi" w:cstheme="majorHAnsi"/>
-        </w:rPr>
-        <w:t>47</w:t>
-      </w:r>
-      <w:r>
-        <w:rPr>
-          <w:rFonts w:asciiTheme="majorHAnsi" w:hAnsiTheme="majorHAnsi" w:cstheme="majorHAnsi"/>
-        </w:rPr>
-        <w:t>_CT2</w:t>
+        <w:t>J2-1647_CT2</w:t>
       </w:r>
       <w:r>
         <w:rPr>
@@ -657,19 +489,7 @@
         <w:rPr>
           <w:rFonts w:asciiTheme="majorHAnsi" w:hAnsiTheme="majorHAnsi" w:cstheme="majorHAnsi"/>
         </w:rPr>
-        <w:t>J2-16</w:t>
-      </w:r>
-      <w:r>
-        <w:rPr>
-          <w:rFonts w:asciiTheme="majorHAnsi" w:hAnsiTheme="majorHAnsi" w:cstheme="majorHAnsi"/>
-        </w:rPr>
-        <w:t>48</w:t>
-      </w:r>
-      <w:r>
-        <w:rPr>
-          <w:rFonts w:asciiTheme="majorHAnsi" w:hAnsiTheme="majorHAnsi" w:cstheme="majorHAnsi"/>
-        </w:rPr>
-        <w:t>_CT2</w:t>
+        <w:t>J2-1648_CT2</w:t>
       </w:r>
       <w:r>
         <w:rPr>
@@ -694,19 +514,7 @@
         <w:rPr>
           <w:rFonts w:asciiTheme="majorHAnsi" w:hAnsiTheme="majorHAnsi" w:cstheme="majorHAnsi"/>
         </w:rPr>
-        <w:t>J2-16</w:t>
-      </w:r>
-      <w:r>
-        <w:rPr>
-          <w:rFonts w:asciiTheme="majorHAnsi" w:hAnsiTheme="majorHAnsi" w:cstheme="majorHAnsi"/>
-        </w:rPr>
-        <w:t>50</w:t>
-      </w:r>
-      <w:r>
-        <w:rPr>
-          <w:rFonts w:asciiTheme="majorHAnsi" w:hAnsiTheme="majorHAnsi" w:cstheme="majorHAnsi"/>
-        </w:rPr>
-        <w:t>_CT2</w:t>
+        <w:t>J2-1650_CT2</w:t>
       </w:r>
       <w:r>
         <w:rPr>
@@ -731,19 +539,7 @@
         <w:rPr>
           <w:rFonts w:asciiTheme="majorHAnsi" w:hAnsiTheme="majorHAnsi" w:cstheme="majorHAnsi"/>
         </w:rPr>
-        <w:t>J2-16</w:t>
-      </w:r>
-      <w:r>
-        <w:rPr>
-          <w:rFonts w:asciiTheme="majorHAnsi" w:hAnsiTheme="majorHAnsi" w:cstheme="majorHAnsi"/>
-        </w:rPr>
-        <w:t>52</w:t>
-      </w:r>
-      <w:r>
-        <w:rPr>
-          <w:rFonts w:asciiTheme="majorHAnsi" w:hAnsiTheme="majorHAnsi" w:cstheme="majorHAnsi"/>
-        </w:rPr>
-        <w:t>_CT2</w:t>
+        <w:t>J2-1652_CT2</w:t>
       </w:r>
       <w:r>
         <w:rPr>
@@ -768,19 +564,7 @@
         <w:rPr>
           <w:rFonts w:asciiTheme="majorHAnsi" w:hAnsiTheme="majorHAnsi" w:cstheme="majorHAnsi"/>
         </w:rPr>
-        <w:t>J2-16</w:t>
-      </w:r>
-      <w:r>
-        <w:rPr>
-          <w:rFonts w:asciiTheme="majorHAnsi" w:hAnsiTheme="majorHAnsi" w:cstheme="majorHAnsi"/>
-        </w:rPr>
-        <w:t>53</w:t>
-      </w:r>
-      <w:r>
-        <w:rPr>
-          <w:rFonts w:asciiTheme="majorHAnsi" w:hAnsiTheme="majorHAnsi" w:cstheme="majorHAnsi"/>
-        </w:rPr>
-        <w:t>_CT2</w:t>
+        <w:t>J2-1653_CT2</w:t>
       </w:r>
       <w:r>
         <w:rPr>
@@ -805,19 +589,7 @@
         <w:rPr>
           <w:rFonts w:asciiTheme="majorHAnsi" w:hAnsiTheme="majorHAnsi" w:cstheme="majorHAnsi"/>
         </w:rPr>
-        <w:t>J2-16</w:t>
-      </w:r>
-      <w:r>
-        <w:rPr>
-          <w:rFonts w:asciiTheme="majorHAnsi" w:hAnsiTheme="majorHAnsi" w:cstheme="majorHAnsi"/>
-        </w:rPr>
-        <w:t>56</w:t>
-      </w:r>
-      <w:r>
-        <w:rPr>
-          <w:rFonts w:asciiTheme="majorHAnsi" w:hAnsiTheme="majorHAnsi" w:cstheme="majorHAnsi"/>
-        </w:rPr>
-        <w:t>_CT2</w:t>
+        <w:t>J2-1656_CT2</w:t>
       </w:r>
       <w:r>
         <w:rPr>
@@ -877,19 +649,35 @@
         <w:rPr>
           <w:rFonts w:asciiTheme="majorHAnsi" w:hAnsiTheme="majorHAnsi" w:cstheme="majorHAnsi"/>
         </w:rPr>
-        <w:t>J2-1612</w:t>
-      </w:r>
-      <w:r>
-        <w:rPr>
-          <w:rFonts w:asciiTheme="majorHAnsi" w:hAnsiTheme="majorHAnsi" w:cstheme="majorHAnsi"/>
-        </w:rPr>
+        <w:t xml:space="preserve">J2-1612_sealogExport </w:t>
+      </w:r>
+      <w:r>
+        <w:rPr>
+          <w:rFonts w:asciiTheme="majorHAnsi" w:hAnsiTheme="majorHAnsi" w:cstheme="majorHAnsi"/>
+        </w:rPr>
+        <w:t xml:space="preserve">= </w:t>
+      </w:r>
+      <w:r>
+        <w:rPr>
+          <w:rFonts w:asciiTheme="majorHAnsi" w:hAnsiTheme="majorHAnsi" w:cstheme="majorHAnsi"/>
+        </w:rPr>
+        <w:t>AT50-29_J2-1612</w:t>
+      </w:r>
+      <w:r>
         <w:t>_sealogExport</w:t>
       </w:r>
-      <w:r>
-        <w:rPr>
-          <w:rFonts w:asciiTheme="majorHAnsi" w:hAnsiTheme="majorHAnsi" w:cstheme="majorHAnsi"/>
-        </w:rPr>
-        <w:t xml:space="preserve"> </w:t>
+    </w:p>
+    <w:p>
+      <w:pPr>
+        <w:rPr>
+          <w:rFonts w:asciiTheme="majorHAnsi" w:hAnsiTheme="majorHAnsi" w:cstheme="majorHAnsi"/>
+        </w:rPr>
+      </w:pPr>
+      <w:r>
+        <w:rPr>
+          <w:rFonts w:asciiTheme="majorHAnsi" w:hAnsiTheme="majorHAnsi" w:cstheme="majorHAnsi"/>
+        </w:rPr>
+        <w:t xml:space="preserve">J2-1617_sealogExport </w:t>
       </w:r>
       <w:r>
         <w:rPr>
@@ -901,7 +689,7 @@
         <w:rPr>
           <w:rFonts w:asciiTheme="majorHAnsi" w:hAnsiTheme="majorHAnsi" w:cstheme="majorHAnsi"/>
         </w:rPr>
-        <w:t>AT50-29_J2-1612</w:t>
+        <w:t>AT50-29_J2-1617</w:t>
       </w:r>
       <w:r>
         <w:t>_sealogExport</w:t>
@@ -917,13 +705,7 @@
         <w:rPr>
           <w:rFonts w:asciiTheme="majorHAnsi" w:hAnsiTheme="majorHAnsi" w:cstheme="majorHAnsi"/>
         </w:rPr>
-        <w:t>J2-1617</w:t>
-      </w:r>
-      <w:r>
-        <w:rPr>
-          <w:rFonts w:asciiTheme="majorHAnsi" w:hAnsiTheme="majorHAnsi" w:cstheme="majorHAnsi"/>
-        </w:rPr>
-        <w:t xml:space="preserve">_sealogExport </w:t>
+        <w:t xml:space="preserve">J2-1619_sealogExport </w:t>
       </w:r>
       <w:r>
         <w:rPr>
@@ -935,7 +717,7 @@
         <w:rPr>
           <w:rFonts w:asciiTheme="majorHAnsi" w:hAnsiTheme="majorHAnsi" w:cstheme="majorHAnsi"/>
         </w:rPr>
-        <w:t>AT50-29_J2-1617</w:t>
+        <w:t>AT50-29_J2-1619</w:t>
       </w:r>
       <w:r>
         <w:t>_sealogExport</w:t>
@@ -951,13 +733,7 @@
         <w:rPr>
           <w:rFonts w:asciiTheme="majorHAnsi" w:hAnsiTheme="majorHAnsi" w:cstheme="majorHAnsi"/>
         </w:rPr>
-        <w:t>J2-1619</w:t>
-      </w:r>
-      <w:r>
-        <w:rPr>
-          <w:rFonts w:asciiTheme="majorHAnsi" w:hAnsiTheme="majorHAnsi" w:cstheme="majorHAnsi"/>
-        </w:rPr>
-        <w:t xml:space="preserve">_sealogExport </w:t>
+        <w:t xml:space="preserve">J2-1621_sealogExport </w:t>
       </w:r>
       <w:r>
         <w:rPr>
@@ -969,7 +745,7 @@
         <w:rPr>
           <w:rFonts w:asciiTheme="majorHAnsi" w:hAnsiTheme="majorHAnsi" w:cstheme="majorHAnsi"/>
         </w:rPr>
-        <w:t>AT50-29_J2-1619</w:t>
+        <w:t>AT50-29_J2-1621</w:t>
       </w:r>
       <w:r>
         <w:t>_sealogExport</w:t>
@@ -985,19 +761,7 @@
         <w:rPr>
           <w:rFonts w:asciiTheme="majorHAnsi" w:hAnsiTheme="majorHAnsi" w:cstheme="majorHAnsi"/>
         </w:rPr>
-        <w:t>J2-16</w:t>
-      </w:r>
-      <w:r>
-        <w:rPr>
-          <w:rFonts w:asciiTheme="majorHAnsi" w:hAnsiTheme="majorHAnsi" w:cstheme="majorHAnsi"/>
-        </w:rPr>
-        <w:t>21</w:t>
-      </w:r>
-      <w:r>
-        <w:rPr>
-          <w:rFonts w:asciiTheme="majorHAnsi" w:hAnsiTheme="majorHAnsi" w:cstheme="majorHAnsi"/>
-        </w:rPr>
-        <w:t xml:space="preserve">_sealogExport </w:t>
+        <w:t xml:space="preserve">J2-1623_sealogExport </w:t>
       </w:r>
       <w:r>
         <w:rPr>
@@ -1009,7 +773,7 @@
         <w:rPr>
           <w:rFonts w:asciiTheme="majorHAnsi" w:hAnsiTheme="majorHAnsi" w:cstheme="majorHAnsi"/>
         </w:rPr>
-        <w:t>AT50-29_J2-1621</w:t>
+        <w:t>AT50-29_J2-1623</w:t>
       </w:r>
       <w:r>
         <w:t>_sealogExport</w:t>
@@ -1025,19 +789,7 @@
         <w:rPr>
           <w:rFonts w:asciiTheme="majorHAnsi" w:hAnsiTheme="majorHAnsi" w:cstheme="majorHAnsi"/>
         </w:rPr>
-        <w:t>J2-16</w:t>
-      </w:r>
-      <w:r>
-        <w:rPr>
-          <w:rFonts w:asciiTheme="majorHAnsi" w:hAnsiTheme="majorHAnsi" w:cstheme="majorHAnsi"/>
-        </w:rPr>
-        <w:t>23</w:t>
-      </w:r>
-      <w:r>
-        <w:rPr>
-          <w:rFonts w:asciiTheme="majorHAnsi" w:hAnsiTheme="majorHAnsi" w:cstheme="majorHAnsi"/>
-        </w:rPr>
-        <w:t xml:space="preserve">_sealogExport </w:t>
+        <w:t xml:space="preserve">J2-1635_sealogExport </w:t>
       </w:r>
       <w:r>
         <w:rPr>
@@ -1049,7 +801,7 @@
         <w:rPr>
           <w:rFonts w:asciiTheme="majorHAnsi" w:hAnsiTheme="majorHAnsi" w:cstheme="majorHAnsi"/>
         </w:rPr>
-        <w:t>AT50-29_J2-1623</w:t>
+        <w:t>AT50-29_J2-1635</w:t>
       </w:r>
       <w:r>
         <w:t>_sealogExport</w:t>
@@ -1065,19 +817,7 @@
         <w:rPr>
           <w:rFonts w:asciiTheme="majorHAnsi" w:hAnsiTheme="majorHAnsi" w:cstheme="majorHAnsi"/>
         </w:rPr>
-        <w:t>J2-16</w:t>
-      </w:r>
-      <w:r>
-        <w:rPr>
-          <w:rFonts w:asciiTheme="majorHAnsi" w:hAnsiTheme="majorHAnsi" w:cstheme="majorHAnsi"/>
-        </w:rPr>
-        <w:t>35</w:t>
-      </w:r>
-      <w:r>
-        <w:rPr>
-          <w:rFonts w:asciiTheme="majorHAnsi" w:hAnsiTheme="majorHAnsi" w:cstheme="majorHAnsi"/>
-        </w:rPr>
-        <w:t xml:space="preserve">_sealogExport </w:t>
+        <w:t xml:space="preserve">J2-1647_sealogExport </w:t>
       </w:r>
       <w:r>
         <w:rPr>
@@ -1089,7 +829,7 @@
         <w:rPr>
           <w:rFonts w:asciiTheme="majorHAnsi" w:hAnsiTheme="majorHAnsi" w:cstheme="majorHAnsi"/>
         </w:rPr>
-        <w:t>AT50-29_J2-1635</w:t>
+        <w:t>AT50-29_J2-1647</w:t>
       </w:r>
       <w:r>
         <w:t>_sealogExport</w:t>
@@ -1105,19 +845,7 @@
         <w:rPr>
           <w:rFonts w:asciiTheme="majorHAnsi" w:hAnsiTheme="majorHAnsi" w:cstheme="majorHAnsi"/>
         </w:rPr>
-        <w:t>J2-16</w:t>
-      </w:r>
-      <w:r>
-        <w:rPr>
-          <w:rFonts w:asciiTheme="majorHAnsi" w:hAnsiTheme="majorHAnsi" w:cstheme="majorHAnsi"/>
-        </w:rPr>
-        <w:t>47</w:t>
-      </w:r>
-      <w:r>
-        <w:rPr>
-          <w:rFonts w:asciiTheme="majorHAnsi" w:hAnsiTheme="majorHAnsi" w:cstheme="majorHAnsi"/>
-        </w:rPr>
-        <w:t xml:space="preserve">_sealogExport </w:t>
+        <w:t xml:space="preserve">J2-1648_sealogExport </w:t>
       </w:r>
       <w:r>
         <w:rPr>
@@ -1129,7 +857,7 @@
         <w:rPr>
           <w:rFonts w:asciiTheme="majorHAnsi" w:hAnsiTheme="majorHAnsi" w:cstheme="majorHAnsi"/>
         </w:rPr>
-        <w:t>AT50-29_J2-1647</w:t>
+        <w:t>AT50-29_J2-1648</w:t>
       </w:r>
       <w:r>
         <w:t>_sealogExport</w:t>
@@ -1145,19 +873,7 @@
         <w:rPr>
           <w:rFonts w:asciiTheme="majorHAnsi" w:hAnsiTheme="majorHAnsi" w:cstheme="majorHAnsi"/>
         </w:rPr>
-        <w:t>J2-16</w:t>
-      </w:r>
-      <w:r>
-        <w:rPr>
-          <w:rFonts w:asciiTheme="majorHAnsi" w:hAnsiTheme="majorHAnsi" w:cstheme="majorHAnsi"/>
-        </w:rPr>
-        <w:t>48</w:t>
-      </w:r>
-      <w:r>
-        <w:rPr>
-          <w:rFonts w:asciiTheme="majorHAnsi" w:hAnsiTheme="majorHAnsi" w:cstheme="majorHAnsi"/>
-        </w:rPr>
-        <w:t xml:space="preserve">_sealogExport </w:t>
+        <w:t xml:space="preserve">J2-1650_sealogExport </w:t>
       </w:r>
       <w:r>
         <w:rPr>
@@ -1169,7 +885,7 @@
         <w:rPr>
           <w:rFonts w:asciiTheme="majorHAnsi" w:hAnsiTheme="majorHAnsi" w:cstheme="majorHAnsi"/>
         </w:rPr>
-        <w:t>AT50-29_J2-1648</w:t>
+        <w:t>AT50-29_J2-1650</w:t>
       </w:r>
       <w:r>
         <w:t>_sealogExport</w:t>
@@ -1185,19 +901,7 @@
         <w:rPr>
           <w:rFonts w:asciiTheme="majorHAnsi" w:hAnsiTheme="majorHAnsi" w:cstheme="majorHAnsi"/>
         </w:rPr>
-        <w:t>J2-16</w:t>
-      </w:r>
-      <w:r>
-        <w:rPr>
-          <w:rFonts w:asciiTheme="majorHAnsi" w:hAnsiTheme="majorHAnsi" w:cstheme="majorHAnsi"/>
-        </w:rPr>
-        <w:t>50</w:t>
-      </w:r>
-      <w:r>
-        <w:rPr>
-          <w:rFonts w:asciiTheme="majorHAnsi" w:hAnsiTheme="majorHAnsi" w:cstheme="majorHAnsi"/>
-        </w:rPr>
-        <w:t xml:space="preserve">_sealogExport </w:t>
+        <w:t xml:space="preserve">J2-1652_sealogExport </w:t>
       </w:r>
       <w:r>
         <w:rPr>
@@ -1209,7 +913,7 @@
         <w:rPr>
           <w:rFonts w:asciiTheme="majorHAnsi" w:hAnsiTheme="majorHAnsi" w:cstheme="majorHAnsi"/>
         </w:rPr>
-        <w:t>AT50-29_J2-1650</w:t>
+        <w:t>AT50-29_J2-1652</w:t>
       </w:r>
       <w:r>
         <w:t>_sealogExport</w:t>
@@ -1225,19 +929,7 @@
         <w:rPr>
           <w:rFonts w:asciiTheme="majorHAnsi" w:hAnsiTheme="majorHAnsi" w:cstheme="majorHAnsi"/>
         </w:rPr>
-        <w:t>J2-16</w:t>
-      </w:r>
-      <w:r>
-        <w:rPr>
-          <w:rFonts w:asciiTheme="majorHAnsi" w:hAnsiTheme="majorHAnsi" w:cstheme="majorHAnsi"/>
-        </w:rPr>
-        <w:t>52</w:t>
-      </w:r>
-      <w:r>
-        <w:rPr>
-          <w:rFonts w:asciiTheme="majorHAnsi" w:hAnsiTheme="majorHAnsi" w:cstheme="majorHAnsi"/>
-        </w:rPr>
-        <w:t xml:space="preserve">_sealogExport </w:t>
+        <w:t xml:space="preserve">J2-1653_sealogExport </w:t>
       </w:r>
       <w:r>
         <w:rPr>
@@ -1249,7 +941,7 @@
         <w:rPr>
           <w:rFonts w:asciiTheme="majorHAnsi" w:hAnsiTheme="majorHAnsi" w:cstheme="majorHAnsi"/>
         </w:rPr>
-        <w:t>AT50-29_J2-1652</w:t>
+        <w:t>AT50-29_J2-1653</w:t>
       </w:r>
       <w:r>
         <w:t>_sealogExport</w:t>
@@ -1265,59 +957,7 @@
         <w:rPr>
           <w:rFonts w:asciiTheme="majorHAnsi" w:hAnsiTheme="majorHAnsi" w:cstheme="majorHAnsi"/>
         </w:rPr>
-        <w:t>J2-16</w:t>
-      </w:r>
-      <w:r>
-        <w:rPr>
-          <w:rFonts w:asciiTheme="majorHAnsi" w:hAnsiTheme="majorHAnsi" w:cstheme="majorHAnsi"/>
-        </w:rPr>
-        <w:t>53</w:t>
-      </w:r>
-      <w:r>
-        <w:rPr>
-          <w:rFonts w:asciiTheme="majorHAnsi" w:hAnsiTheme="majorHAnsi" w:cstheme="majorHAnsi"/>
-        </w:rPr>
-        <w:t xml:space="preserve">_sealogExport </w:t>
-      </w:r>
-      <w:r>
-        <w:rPr>
-          <w:rFonts w:asciiTheme="majorHAnsi" w:hAnsiTheme="majorHAnsi" w:cstheme="majorHAnsi"/>
-        </w:rPr>
-        <w:t xml:space="preserve">= </w:t>
-      </w:r>
-      <w:r>
-        <w:rPr>
-          <w:rFonts w:asciiTheme="majorHAnsi" w:hAnsiTheme="majorHAnsi" w:cstheme="majorHAnsi"/>
-        </w:rPr>
-        <w:t>AT50-29_J2-1653</w:t>
-      </w:r>
-      <w:r>
-        <w:t>_sealogExport</w:t>
-      </w:r>
-    </w:p>
-    <w:p>
-      <w:pPr>
-        <w:rPr>
-          <w:rFonts w:asciiTheme="majorHAnsi" w:hAnsiTheme="majorHAnsi" w:cstheme="majorHAnsi"/>
-        </w:rPr>
-      </w:pPr>
-      <w:r>
-        <w:rPr>
-          <w:rFonts w:asciiTheme="majorHAnsi" w:hAnsiTheme="majorHAnsi" w:cstheme="majorHAnsi"/>
-        </w:rPr>
-        <w:t>J2-16</w:t>
-      </w:r>
-      <w:r>
-        <w:rPr>
-          <w:rFonts w:asciiTheme="majorHAnsi" w:hAnsiTheme="majorHAnsi" w:cstheme="majorHAnsi"/>
-        </w:rPr>
-        <w:t>56</w:t>
-      </w:r>
-      <w:r>
-        <w:rPr>
-          <w:rFonts w:asciiTheme="majorHAnsi" w:hAnsiTheme="majorHAnsi" w:cstheme="majorHAnsi"/>
-        </w:rPr>
-        <w:t xml:space="preserve">_sealogExport </w:t>
+        <w:t xml:space="preserve">J2-1656_sealogExport </w:t>
       </w:r>
       <w:r>
         <w:rPr>
@@ -1416,6 +1056,242 @@
     </w:p>
     <w:p>
       <w:pPr>
+        <w:rPr>
+          <w:rFonts w:ascii="Calibri" w:eastAsia="Times New Roman" w:hAnsi="Calibri" w:cs="Calibri"/>
+          <w:color w:val="000000"/>
+        </w:rPr>
+      </w:pPr>
+      <w:r>
+        <w:rPr>
+          <w:rFonts w:asciiTheme="majorHAnsi" w:hAnsiTheme="majorHAnsi" w:cstheme="majorHAnsi"/>
+        </w:rPr>
+        <w:t xml:space="preserve">AT50-29, J2-1602, </w:t>
+      </w:r>
+      <w:proofErr w:type="spellStart"/>
+      <w:r>
+        <w:rPr>
+          <w:rFonts w:asciiTheme="majorHAnsi" w:hAnsiTheme="majorHAnsi" w:cstheme="majorHAnsi"/>
+        </w:rPr>
+        <w:t>Niskin</w:t>
+      </w:r>
+      <w:proofErr w:type="spellEnd"/>
+      <w:r>
+        <w:rPr>
+          <w:rFonts w:asciiTheme="majorHAnsi" w:hAnsiTheme="majorHAnsi" w:cstheme="majorHAnsi"/>
+        </w:rPr>
+        <w:t>:</w:t>
+      </w:r>
+      <w:r>
+        <w:rPr>
+          <w:rFonts w:asciiTheme="majorHAnsi" w:hAnsiTheme="majorHAnsi" w:cstheme="majorHAnsi"/>
+        </w:rPr>
+        <w:t xml:space="preserve"> Forward Starboard: </w:t>
+      </w:r>
+      <w:proofErr w:type="spellStart"/>
+      <w:r>
+        <w:rPr>
+          <w:rFonts w:asciiTheme="majorHAnsi" w:hAnsiTheme="majorHAnsi" w:cstheme="majorHAnsi"/>
+        </w:rPr>
+        <w:t>CastFlag</w:t>
+      </w:r>
+      <w:proofErr w:type="spellEnd"/>
+      <w:r>
+        <w:rPr>
+          <w:rFonts w:asciiTheme="majorHAnsi" w:hAnsiTheme="majorHAnsi" w:cstheme="majorHAnsi"/>
+        </w:rPr>
+        <w:t xml:space="preserve">: </w:t>
+      </w:r>
+      <w:proofErr w:type="spellStart"/>
+      <w:r>
+        <w:rPr>
+          <w:rFonts w:ascii="Calibri" w:eastAsia="Times New Roman" w:hAnsi="Calibri" w:cs="Calibri"/>
+          <w:color w:val="000000"/>
+        </w:rPr>
+        <w:t>CastFlag</w:t>
+      </w:r>
+      <w:proofErr w:type="spellEnd"/>
+      <w:r>
+        <w:rPr>
+          <w:rFonts w:ascii="Calibri" w:eastAsia="Times New Roman" w:hAnsi="Calibri" w:cs="Calibri"/>
+          <w:color w:val="000000"/>
+        </w:rPr>
+        <w:t xml:space="preserve">: </w:t>
+      </w:r>
+      <w:proofErr w:type="spellStart"/>
+      <w:r>
+        <w:rPr>
+          <w:rFonts w:ascii="Calibri" w:eastAsia="Times New Roman" w:hAnsi="Calibri" w:cs="Calibri"/>
+          <w:color w:val="000000"/>
+        </w:rPr>
+        <w:t>sealogExport</w:t>
+      </w:r>
+      <w:proofErr w:type="spellEnd"/>
+      <w:r>
+        <w:rPr>
+          <w:rFonts w:ascii="Calibri" w:eastAsia="Times New Roman" w:hAnsi="Calibri" w:cs="Calibri"/>
+          <w:color w:val="000000"/>
+        </w:rPr>
+        <w:t xml:space="preserve"> file included corrupt </w:t>
+      </w:r>
+      <w:proofErr w:type="spellStart"/>
+      <w:r>
+        <w:rPr>
+          <w:rFonts w:ascii="Calibri" w:eastAsia="Times New Roman" w:hAnsi="Calibri" w:cs="Calibri"/>
+          <w:color w:val="000000"/>
+        </w:rPr>
+        <w:t>lat</w:t>
+      </w:r>
+      <w:proofErr w:type="spellEnd"/>
+      <w:r>
+        <w:rPr>
+          <w:rFonts w:ascii="Calibri" w:eastAsia="Times New Roman" w:hAnsi="Calibri" w:cs="Calibri"/>
+          <w:color w:val="000000"/>
+        </w:rPr>
+        <w:t>/long; positions taken from cast log</w:t>
+      </w:r>
+      <w:r>
+        <w:rPr>
+          <w:rFonts w:asciiTheme="majorHAnsi" w:hAnsiTheme="majorHAnsi" w:cstheme="majorHAnsi"/>
+        </w:rPr>
+        <w:t xml:space="preserve">, </w:t>
+      </w:r>
+      <w:proofErr w:type="spellStart"/>
+      <w:r>
+        <w:rPr>
+          <w:rFonts w:asciiTheme="majorHAnsi" w:hAnsiTheme="majorHAnsi" w:cstheme="majorHAnsi"/>
+        </w:rPr>
+        <w:t>DiscreteSampleFlag</w:t>
+      </w:r>
+      <w:proofErr w:type="spellEnd"/>
+      <w:r>
+        <w:rPr>
+          <w:rFonts w:asciiTheme="majorHAnsi" w:hAnsiTheme="majorHAnsi" w:cstheme="majorHAnsi"/>
+        </w:rPr>
+        <w:t>: Oxygen pickled with 1.5 mL of NaOH</w:t>
+      </w:r>
+    </w:p>
+    <w:p>
+      <w:pPr>
+        <w:rPr>
+          <w:rFonts w:ascii="Calibri" w:eastAsia="Times New Roman" w:hAnsi="Calibri" w:cs="Calibri"/>
+          <w:color w:val="000000"/>
+        </w:rPr>
+      </w:pPr>
+      <w:r>
+        <w:rPr>
+          <w:rFonts w:asciiTheme="majorHAnsi" w:hAnsiTheme="majorHAnsi" w:cstheme="majorHAnsi"/>
+        </w:rPr>
+        <w:t>AT50-29, J2-160</w:t>
+      </w:r>
+      <w:r>
+        <w:rPr>
+          <w:rFonts w:asciiTheme="majorHAnsi" w:hAnsiTheme="majorHAnsi" w:cstheme="majorHAnsi"/>
+        </w:rPr>
+        <w:t>2</w:t>
+      </w:r>
+      <w:r>
+        <w:rPr>
+          <w:rFonts w:asciiTheme="majorHAnsi" w:hAnsiTheme="majorHAnsi" w:cstheme="majorHAnsi"/>
+        </w:rPr>
+        <w:t xml:space="preserve">, </w:t>
+      </w:r>
+      <w:proofErr w:type="spellStart"/>
+      <w:r>
+        <w:rPr>
+          <w:rFonts w:asciiTheme="majorHAnsi" w:hAnsiTheme="majorHAnsi" w:cstheme="majorHAnsi"/>
+        </w:rPr>
+        <w:t>Niskin</w:t>
+      </w:r>
+      <w:proofErr w:type="spellEnd"/>
+      <w:r>
+        <w:rPr>
+          <w:rFonts w:asciiTheme="majorHAnsi" w:hAnsiTheme="majorHAnsi" w:cstheme="majorHAnsi"/>
+        </w:rPr>
+        <w:t>:</w:t>
+      </w:r>
+      <w:r>
+        <w:rPr>
+          <w:rFonts w:asciiTheme="majorHAnsi" w:hAnsiTheme="majorHAnsi" w:cstheme="majorHAnsi"/>
+        </w:rPr>
+        <w:t xml:space="preserve"> </w:t>
+      </w:r>
+      <w:r>
+        <w:rPr>
+          <w:rFonts w:asciiTheme="majorHAnsi" w:hAnsiTheme="majorHAnsi" w:cstheme="majorHAnsi"/>
+        </w:rPr>
+        <w:t>Aft</w:t>
+      </w:r>
+      <w:r>
+        <w:rPr>
+          <w:rFonts w:asciiTheme="majorHAnsi" w:hAnsiTheme="majorHAnsi" w:cstheme="majorHAnsi"/>
+        </w:rPr>
+        <w:t xml:space="preserve"> Starboard: </w:t>
+      </w:r>
+      <w:proofErr w:type="spellStart"/>
+      <w:r>
+        <w:rPr>
+          <w:rFonts w:asciiTheme="majorHAnsi" w:hAnsiTheme="majorHAnsi" w:cstheme="majorHAnsi"/>
+        </w:rPr>
+        <w:t>CastFlag</w:t>
+      </w:r>
+      <w:proofErr w:type="spellEnd"/>
+      <w:r>
+        <w:rPr>
+          <w:rFonts w:asciiTheme="majorHAnsi" w:hAnsiTheme="majorHAnsi" w:cstheme="majorHAnsi"/>
+        </w:rPr>
+        <w:t xml:space="preserve">: </w:t>
+      </w:r>
+      <w:proofErr w:type="spellStart"/>
+      <w:r>
+        <w:rPr>
+          <w:rFonts w:ascii="Calibri" w:eastAsia="Times New Roman" w:hAnsi="Calibri" w:cs="Calibri"/>
+          <w:color w:val="000000"/>
+        </w:rPr>
+        <w:t>CastFlag</w:t>
+      </w:r>
+      <w:proofErr w:type="spellEnd"/>
+      <w:r>
+        <w:rPr>
+          <w:rFonts w:ascii="Calibri" w:eastAsia="Times New Roman" w:hAnsi="Calibri" w:cs="Calibri"/>
+          <w:color w:val="000000"/>
+        </w:rPr>
+        <w:t xml:space="preserve">: </w:t>
+      </w:r>
+      <w:proofErr w:type="spellStart"/>
+      <w:r>
+        <w:rPr>
+          <w:rFonts w:ascii="Calibri" w:eastAsia="Times New Roman" w:hAnsi="Calibri" w:cs="Calibri"/>
+          <w:color w:val="000000"/>
+        </w:rPr>
+        <w:t>sealogExport</w:t>
+      </w:r>
+      <w:proofErr w:type="spellEnd"/>
+      <w:r>
+        <w:rPr>
+          <w:rFonts w:ascii="Calibri" w:eastAsia="Times New Roman" w:hAnsi="Calibri" w:cs="Calibri"/>
+          <w:color w:val="000000"/>
+        </w:rPr>
+        <w:t xml:space="preserve"> file included corrupt </w:t>
+      </w:r>
+      <w:proofErr w:type="spellStart"/>
+      <w:r>
+        <w:rPr>
+          <w:rFonts w:ascii="Calibri" w:eastAsia="Times New Roman" w:hAnsi="Calibri" w:cs="Calibri"/>
+          <w:color w:val="000000"/>
+        </w:rPr>
+        <w:t>lat</w:t>
+      </w:r>
+      <w:proofErr w:type="spellEnd"/>
+      <w:r>
+        <w:rPr>
+          <w:rFonts w:ascii="Calibri" w:eastAsia="Times New Roman" w:hAnsi="Calibri" w:cs="Calibri"/>
+          <w:color w:val="000000"/>
+        </w:rPr>
+        <w:t>/long; positions taken from cast log</w:t>
+      </w:r>
+    </w:p>
+    <w:p>
+      <w:pPr>
         <w:adjustRightInd w:val="0"/>
         <w:contextualSpacing/>
         <w:rPr>
@@ -1426,7 +1302,7 @@
         <w:rPr>
           <w:rFonts w:asciiTheme="majorHAnsi" w:hAnsiTheme="majorHAnsi" w:cstheme="majorHAnsi"/>
         </w:rPr>
-        <w:t xml:space="preserve">AT50-29, J2-1602, </w:t>
+        <w:t xml:space="preserve">AT50-29, CTD-001, </w:t>
       </w:r>
       <w:proofErr w:type="spellStart"/>
       <w:r>
@@ -1440,67 +1316,7 @@
         <w:rPr>
           <w:rFonts w:asciiTheme="majorHAnsi" w:hAnsiTheme="majorHAnsi" w:cstheme="majorHAnsi"/>
         </w:rPr>
-        <w:t>:</w:t>
-      </w:r>
-      <w:r>
-        <w:rPr>
-          <w:rFonts w:asciiTheme="majorHAnsi" w:hAnsiTheme="majorHAnsi" w:cstheme="majorHAnsi"/>
-        </w:rPr>
-        <w:t xml:space="preserve"> Forward Starboard: </w:t>
-      </w:r>
-      <w:proofErr w:type="spellStart"/>
-      <w:r>
-        <w:rPr>
-          <w:rFonts w:asciiTheme="majorHAnsi" w:hAnsiTheme="majorHAnsi" w:cstheme="majorHAnsi"/>
-        </w:rPr>
-        <w:t>CastFlag</w:t>
-      </w:r>
-      <w:proofErr w:type="spellEnd"/>
-      <w:r>
-        <w:rPr>
-          <w:rFonts w:asciiTheme="majorHAnsi" w:hAnsiTheme="majorHAnsi" w:cstheme="majorHAnsi"/>
-        </w:rPr>
-        <w:t xml:space="preserve">: </w:t>
-      </w:r>
-      <w:r>
-        <w:rPr>
-          <w:rFonts w:asciiTheme="majorHAnsi" w:hAnsiTheme="majorHAnsi" w:cstheme="majorHAnsi"/>
-        </w:rPr>
-        <w:t xml:space="preserve">ROV </w:t>
-      </w:r>
-      <w:proofErr w:type="spellStart"/>
-      <w:r>
-        <w:rPr>
-          <w:rFonts w:asciiTheme="majorHAnsi" w:hAnsiTheme="majorHAnsi" w:cstheme="majorHAnsi"/>
-        </w:rPr>
-        <w:t>sealogExport</w:t>
-      </w:r>
-      <w:proofErr w:type="spellEnd"/>
-      <w:r>
-        <w:rPr>
-          <w:rFonts w:asciiTheme="majorHAnsi" w:hAnsiTheme="majorHAnsi" w:cstheme="majorHAnsi"/>
-        </w:rPr>
-        <w:t xml:space="preserve"> file included corrupt </w:t>
-      </w:r>
-      <w:proofErr w:type="spellStart"/>
-      <w:r>
-        <w:rPr>
-          <w:rFonts w:asciiTheme="majorHAnsi" w:hAnsiTheme="majorHAnsi" w:cstheme="majorHAnsi"/>
-        </w:rPr>
-        <w:t>lat</w:t>
-      </w:r>
-      <w:proofErr w:type="spellEnd"/>
-      <w:r>
-        <w:rPr>
-          <w:rFonts w:asciiTheme="majorHAnsi" w:hAnsiTheme="majorHAnsi" w:cstheme="majorHAnsi"/>
-        </w:rPr>
-        <w:t>/long</w:t>
-      </w:r>
-      <w:r>
-        <w:rPr>
-          <w:rFonts w:asciiTheme="majorHAnsi" w:hAnsiTheme="majorHAnsi" w:cstheme="majorHAnsi"/>
-        </w:rPr>
-        <w:t xml:space="preserve">, </w:t>
+        <w:t xml:space="preserve"> 3: </w:t>
       </w:r>
       <w:proofErr w:type="spellStart"/>
       <w:r>
@@ -1529,7 +1345,7 @@
         <w:rPr>
           <w:rFonts w:asciiTheme="majorHAnsi" w:hAnsiTheme="majorHAnsi" w:cstheme="majorHAnsi"/>
         </w:rPr>
-        <w:t xml:space="preserve">AT50-29, J2-1602, </w:t>
+        <w:t xml:space="preserve">AT50-29, CTD-001, </w:t>
       </w:r>
       <w:proofErr w:type="spellStart"/>
       <w:r>
@@ -1543,73 +1359,21 @@
         <w:rPr>
           <w:rFonts w:asciiTheme="majorHAnsi" w:hAnsiTheme="majorHAnsi" w:cstheme="majorHAnsi"/>
         </w:rPr>
-        <w:t>:</w:t>
-      </w:r>
-      <w:r>
-        <w:rPr>
-          <w:rFonts w:asciiTheme="majorHAnsi" w:hAnsiTheme="majorHAnsi" w:cstheme="majorHAnsi"/>
-        </w:rPr>
-        <w:t xml:space="preserve"> </w:t>
-      </w:r>
-      <w:r>
-        <w:rPr>
-          <w:rFonts w:asciiTheme="majorHAnsi" w:hAnsiTheme="majorHAnsi" w:cstheme="majorHAnsi"/>
-        </w:rPr>
-        <w:t>Aft</w:t>
-      </w:r>
-      <w:r>
-        <w:rPr>
-          <w:rFonts w:asciiTheme="majorHAnsi" w:hAnsiTheme="majorHAnsi" w:cstheme="majorHAnsi"/>
-        </w:rPr>
-        <w:t xml:space="preserve"> Starboard: </w:t>
+        <w:t xml:space="preserve"> 5: </w:t>
       </w:r>
       <w:proofErr w:type="spellStart"/>
       <w:r>
         <w:rPr>
           <w:rFonts w:asciiTheme="majorHAnsi" w:hAnsiTheme="majorHAnsi" w:cstheme="majorHAnsi"/>
         </w:rPr>
-        <w:t>CastFlag</w:t>
+        <w:t>DiscreteSampleFlag</w:t>
       </w:r>
       <w:proofErr w:type="spellEnd"/>
       <w:r>
         <w:rPr>
           <w:rFonts w:asciiTheme="majorHAnsi" w:hAnsiTheme="majorHAnsi" w:cstheme="majorHAnsi"/>
         </w:rPr>
-        <w:t xml:space="preserve">: </w:t>
-      </w:r>
-      <w:r>
-        <w:rPr>
-          <w:rFonts w:asciiTheme="majorHAnsi" w:hAnsiTheme="majorHAnsi" w:cstheme="majorHAnsi"/>
-        </w:rPr>
-        <w:t xml:space="preserve">ROV </w:t>
-      </w:r>
-      <w:proofErr w:type="spellStart"/>
-      <w:r>
-        <w:rPr>
-          <w:rFonts w:asciiTheme="majorHAnsi" w:hAnsiTheme="majorHAnsi" w:cstheme="majorHAnsi"/>
-        </w:rPr>
-        <w:t>sealogExport</w:t>
-      </w:r>
-      <w:proofErr w:type="spellEnd"/>
-      <w:r>
-        <w:rPr>
-          <w:rFonts w:asciiTheme="majorHAnsi" w:hAnsiTheme="majorHAnsi" w:cstheme="majorHAnsi"/>
-        </w:rPr>
-        <w:t xml:space="preserve"> file included corrupt </w:t>
-      </w:r>
-      <w:proofErr w:type="spellStart"/>
-      <w:r>
-        <w:rPr>
-          <w:rFonts w:asciiTheme="majorHAnsi" w:hAnsiTheme="majorHAnsi" w:cstheme="majorHAnsi"/>
-        </w:rPr>
-        <w:t>lat</w:t>
-      </w:r>
-      <w:proofErr w:type="spellEnd"/>
-      <w:r>
-        <w:rPr>
-          <w:rFonts w:asciiTheme="majorHAnsi" w:hAnsiTheme="majorHAnsi" w:cstheme="majorHAnsi"/>
-        </w:rPr>
-        <w:t>/long</w:t>
+        <w:t>: Oxygen pickled with 1.5 mL of NaOH</w:t>
       </w:r>
     </w:p>
     <w:p>
@@ -1638,7 +1402,7 @@
         <w:rPr>
           <w:rFonts w:asciiTheme="majorHAnsi" w:hAnsiTheme="majorHAnsi" w:cstheme="majorHAnsi"/>
         </w:rPr>
-        <w:t xml:space="preserve"> 3: </w:t>
+        <w:t xml:space="preserve"> 7: </w:t>
       </w:r>
       <w:proofErr w:type="spellStart"/>
       <w:r>
@@ -1681,7 +1445,7 @@
         <w:rPr>
           <w:rFonts w:asciiTheme="majorHAnsi" w:hAnsiTheme="majorHAnsi" w:cstheme="majorHAnsi"/>
         </w:rPr>
-        <w:t xml:space="preserve"> 5: </w:t>
+        <w:t xml:space="preserve"> 9: </w:t>
       </w:r>
       <w:proofErr w:type="spellStart"/>
       <w:r>
@@ -1724,7 +1488,7 @@
         <w:rPr>
           <w:rFonts w:asciiTheme="majorHAnsi" w:hAnsiTheme="majorHAnsi" w:cstheme="majorHAnsi"/>
         </w:rPr>
-        <w:t xml:space="preserve"> 7: </w:t>
+        <w:t xml:space="preserve"> 11: </w:t>
       </w:r>
       <w:proofErr w:type="spellStart"/>
       <w:r>
@@ -1753,6 +1517,7 @@
         <w:rPr>
           <w:rFonts w:asciiTheme="majorHAnsi" w:hAnsiTheme="majorHAnsi" w:cstheme="majorHAnsi"/>
         </w:rPr>
+        <w:lastRenderedPageBreak/>
         <w:t xml:space="preserve">AT50-29, CTD-001, </w:t>
       </w:r>
       <w:proofErr w:type="spellStart"/>
@@ -1767,7 +1532,7 @@
         <w:rPr>
           <w:rFonts w:asciiTheme="majorHAnsi" w:hAnsiTheme="majorHAnsi" w:cstheme="majorHAnsi"/>
         </w:rPr>
-        <w:t xml:space="preserve"> 9: </w:t>
+        <w:t xml:space="preserve"> 13: </w:t>
       </w:r>
       <w:proofErr w:type="spellStart"/>
       <w:r>
@@ -1810,7 +1575,7 @@
         <w:rPr>
           <w:rFonts w:asciiTheme="majorHAnsi" w:hAnsiTheme="majorHAnsi" w:cstheme="majorHAnsi"/>
         </w:rPr>
-        <w:t xml:space="preserve"> 11: </w:t>
+        <w:t xml:space="preserve"> 15: </w:t>
       </w:r>
       <w:proofErr w:type="spellStart"/>
       <w:r>
@@ -1839,7 +1604,6 @@
         <w:rPr>
           <w:rFonts w:asciiTheme="majorHAnsi" w:hAnsiTheme="majorHAnsi" w:cstheme="majorHAnsi"/>
         </w:rPr>
-        <w:lastRenderedPageBreak/>
         <w:t xml:space="preserve">AT50-29, CTD-001, </w:t>
       </w:r>
       <w:proofErr w:type="spellStart"/>
@@ -1854,7 +1618,7 @@
         <w:rPr>
           <w:rFonts w:asciiTheme="majorHAnsi" w:hAnsiTheme="majorHAnsi" w:cstheme="majorHAnsi"/>
         </w:rPr>
-        <w:t xml:space="preserve"> 13: </w:t>
+        <w:t xml:space="preserve"> 17: </w:t>
       </w:r>
       <w:proofErr w:type="spellStart"/>
       <w:r>
@@ -1897,7 +1661,130 @@
         <w:rPr>
           <w:rFonts w:asciiTheme="majorHAnsi" w:hAnsiTheme="majorHAnsi" w:cstheme="majorHAnsi"/>
         </w:rPr>
-        <w:t xml:space="preserve"> 15: </w:t>
+        <w:t xml:space="preserve"> 19: </w:t>
+      </w:r>
+      <w:proofErr w:type="spellStart"/>
+      <w:r>
+        <w:rPr>
+          <w:rFonts w:asciiTheme="majorHAnsi" w:hAnsiTheme="majorHAnsi" w:cstheme="majorHAnsi"/>
+        </w:rPr>
+        <w:t>DiscreteSampleFlag</w:t>
+      </w:r>
+      <w:proofErr w:type="spellEnd"/>
+      <w:r>
+        <w:rPr>
+          <w:rFonts w:asciiTheme="majorHAnsi" w:hAnsiTheme="majorHAnsi" w:cstheme="majorHAnsi"/>
+        </w:rPr>
+        <w:t>: Oxygen pickled with 1.5 mL of NaOH</w:t>
+      </w:r>
+    </w:p>
+    <w:p>
+      <w:pPr>
+        <w:rPr>
+          <w:rFonts w:ascii="Calibri" w:eastAsia="Times New Roman" w:hAnsi="Calibri" w:cs="Calibri"/>
+          <w:color w:val="000000"/>
+        </w:rPr>
+      </w:pPr>
+      <w:r>
+        <w:rPr>
+          <w:rFonts w:asciiTheme="majorHAnsi" w:hAnsiTheme="majorHAnsi" w:cstheme="majorHAnsi"/>
+        </w:rPr>
+        <w:t xml:space="preserve">AT50-29, J2-1605, </w:t>
+      </w:r>
+      <w:proofErr w:type="spellStart"/>
+      <w:r>
+        <w:rPr>
+          <w:rFonts w:asciiTheme="majorHAnsi" w:hAnsiTheme="majorHAnsi" w:cstheme="majorHAnsi"/>
+        </w:rPr>
+        <w:t>Niskin</w:t>
+      </w:r>
+      <w:proofErr w:type="spellEnd"/>
+      <w:r>
+        <w:rPr>
+          <w:rFonts w:asciiTheme="majorHAnsi" w:hAnsiTheme="majorHAnsi" w:cstheme="majorHAnsi"/>
+        </w:rPr>
+        <w:t>:</w:t>
+      </w:r>
+      <w:r>
+        <w:rPr>
+          <w:rFonts w:asciiTheme="majorHAnsi" w:hAnsiTheme="majorHAnsi" w:cstheme="majorHAnsi"/>
+        </w:rPr>
+        <w:t xml:space="preserve"> Forward: </w:t>
+      </w:r>
+      <w:proofErr w:type="spellStart"/>
+      <w:r>
+        <w:rPr>
+          <w:rFonts w:asciiTheme="majorHAnsi" w:hAnsiTheme="majorHAnsi" w:cstheme="majorHAnsi"/>
+        </w:rPr>
+        <w:t>CastFlag</w:t>
+      </w:r>
+      <w:proofErr w:type="spellEnd"/>
+      <w:r>
+        <w:rPr>
+          <w:rFonts w:asciiTheme="majorHAnsi" w:hAnsiTheme="majorHAnsi" w:cstheme="majorHAnsi"/>
+        </w:rPr>
+        <w:t xml:space="preserve">: </w:t>
+      </w:r>
+      <w:proofErr w:type="spellStart"/>
+      <w:r>
+        <w:rPr>
+          <w:rFonts w:ascii="Calibri" w:eastAsia="Times New Roman" w:hAnsi="Calibri" w:cs="Calibri"/>
+          <w:color w:val="000000"/>
+        </w:rPr>
+        <w:t>CastFlag</w:t>
+      </w:r>
+      <w:proofErr w:type="spellEnd"/>
+      <w:r>
+        <w:rPr>
+          <w:rFonts w:ascii="Calibri" w:eastAsia="Times New Roman" w:hAnsi="Calibri" w:cs="Calibri"/>
+          <w:color w:val="000000"/>
+        </w:rPr>
+        <w:t xml:space="preserve">: </w:t>
+      </w:r>
+      <w:proofErr w:type="spellStart"/>
+      <w:r>
+        <w:rPr>
+          <w:rFonts w:ascii="Calibri" w:eastAsia="Times New Roman" w:hAnsi="Calibri" w:cs="Calibri"/>
+          <w:color w:val="000000"/>
+        </w:rPr>
+        <w:t>sealogExport</w:t>
+      </w:r>
+      <w:proofErr w:type="spellEnd"/>
+      <w:r>
+        <w:rPr>
+          <w:rFonts w:ascii="Calibri" w:eastAsia="Times New Roman" w:hAnsi="Calibri" w:cs="Calibri"/>
+          <w:color w:val="000000"/>
+        </w:rPr>
+        <w:t xml:space="preserve"> file included corrupt </w:t>
+      </w:r>
+      <w:proofErr w:type="spellStart"/>
+      <w:r>
+        <w:rPr>
+          <w:rFonts w:ascii="Calibri" w:eastAsia="Times New Roman" w:hAnsi="Calibri" w:cs="Calibri"/>
+          <w:color w:val="000000"/>
+        </w:rPr>
+        <w:t>lat</w:t>
+      </w:r>
+      <w:proofErr w:type="spellEnd"/>
+      <w:r>
+        <w:rPr>
+          <w:rFonts w:ascii="Calibri" w:eastAsia="Times New Roman" w:hAnsi="Calibri" w:cs="Calibri"/>
+          <w:color w:val="000000"/>
+        </w:rPr>
+        <w:t>/long; positions taken from "@ shallow profiler" annotation, line 97</w:t>
+      </w:r>
+      <w:r>
+        <w:rPr>
+          <w:rFonts w:ascii="Calibri" w:eastAsia="Times New Roman" w:hAnsi="Calibri" w:cs="Calibri"/>
+          <w:color w:val="000000"/>
+        </w:rPr>
+        <w:t>,</w:t>
+      </w:r>
+      <w:r>
+        <w:rPr>
+          <w:rFonts w:asciiTheme="majorHAnsi" w:hAnsiTheme="majorHAnsi" w:cstheme="majorHAnsi"/>
+        </w:rPr>
+        <w:t xml:space="preserve"> </w:t>
       </w:r>
       <w:proofErr w:type="spellStart"/>
       <w:r>
@@ -1926,7 +1813,7 @@
         <w:rPr>
           <w:rFonts w:asciiTheme="majorHAnsi" w:hAnsiTheme="majorHAnsi" w:cstheme="majorHAnsi"/>
         </w:rPr>
-        <w:t xml:space="preserve">AT50-29, CTD-001, </w:t>
+        <w:t xml:space="preserve">AT50-29, CTD-002, </w:t>
       </w:r>
       <w:proofErr w:type="spellStart"/>
       <w:r>
@@ -1940,7 +1827,7 @@
         <w:rPr>
           <w:rFonts w:asciiTheme="majorHAnsi" w:hAnsiTheme="majorHAnsi" w:cstheme="majorHAnsi"/>
         </w:rPr>
-        <w:t xml:space="preserve"> 17: </w:t>
+        <w:t xml:space="preserve"> 3: </w:t>
       </w:r>
       <w:proofErr w:type="spellStart"/>
       <w:r>
@@ -1954,7 +1841,33 @@
         <w:rPr>
           <w:rFonts w:asciiTheme="majorHAnsi" w:hAnsiTheme="majorHAnsi" w:cstheme="majorHAnsi"/>
         </w:rPr>
-        <w:t>: Oxygen pickled with 1.5 mL of NaOH</w:t>
+        <w:t xml:space="preserve">: Oxygen pickled with 1.5 mL of NaOH; Chlorophyll samples </w:t>
+      </w:r>
+      <w:proofErr w:type="gramStart"/>
+      <w:r>
+        <w:rPr>
+          <w:rFonts w:asciiTheme="majorHAnsi" w:hAnsiTheme="majorHAnsi" w:cstheme="majorHAnsi"/>
+        </w:rPr>
+        <w:t>in</w:t>
+      </w:r>
+      <w:r>
+        <w:rPr>
+          <w:rFonts w:asciiTheme="majorHAnsi" w:hAnsiTheme="majorHAnsi" w:cstheme="majorHAnsi"/>
+        </w:rPr>
+        <w:t>c</w:t>
+      </w:r>
+      <w:r>
+        <w:rPr>
+          <w:rFonts w:asciiTheme="majorHAnsi" w:hAnsiTheme="majorHAnsi" w:cstheme="majorHAnsi"/>
+        </w:rPr>
+        <w:t>ludes</w:t>
+      </w:r>
+      <w:proofErr w:type="gramEnd"/>
+      <w:r>
+        <w:rPr>
+          <w:rFonts w:asciiTheme="majorHAnsi" w:hAnsiTheme="majorHAnsi" w:cstheme="majorHAnsi"/>
+        </w:rPr>
+        <w:t xml:space="preserve"> 2 filters as 1st leaked a little</w:t>
       </w:r>
     </w:p>
     <w:p>
@@ -1969,7 +1882,7 @@
         <w:rPr>
           <w:rFonts w:asciiTheme="majorHAnsi" w:hAnsiTheme="majorHAnsi" w:cstheme="majorHAnsi"/>
         </w:rPr>
-        <w:t xml:space="preserve">AT50-29, CTD-001, </w:t>
+        <w:t xml:space="preserve">AT50-29, CTD-002, </w:t>
       </w:r>
       <w:proofErr w:type="spellStart"/>
       <w:r>
@@ -1983,7 +1896,7 @@
         <w:rPr>
           <w:rFonts w:asciiTheme="majorHAnsi" w:hAnsiTheme="majorHAnsi" w:cstheme="majorHAnsi"/>
         </w:rPr>
-        <w:t xml:space="preserve"> 19: </w:t>
+        <w:t xml:space="preserve"> 7: </w:t>
       </w:r>
       <w:proofErr w:type="spellStart"/>
       <w:r>
@@ -2012,7 +1925,7 @@
         <w:rPr>
           <w:rFonts w:asciiTheme="majorHAnsi" w:hAnsiTheme="majorHAnsi" w:cstheme="majorHAnsi"/>
         </w:rPr>
-        <w:t xml:space="preserve">AT50-29, J2-1605, </w:t>
+        <w:t xml:space="preserve">AT50-29, CTD-002, </w:t>
       </w:r>
       <w:proofErr w:type="spellStart"/>
       <w:r>
@@ -2026,81 +1939,21 @@
         <w:rPr>
           <w:rFonts w:asciiTheme="majorHAnsi" w:hAnsiTheme="majorHAnsi" w:cstheme="majorHAnsi"/>
         </w:rPr>
-        <w:t>:</w:t>
-      </w:r>
-      <w:r>
-        <w:rPr>
-          <w:rFonts w:asciiTheme="majorHAnsi" w:hAnsiTheme="majorHAnsi" w:cstheme="majorHAnsi"/>
-        </w:rPr>
-        <w:t xml:space="preserve"> Forward: </w:t>
+        <w:t xml:space="preserve"> 19: </w:t>
       </w:r>
       <w:proofErr w:type="spellStart"/>
       <w:r>
         <w:rPr>
           <w:rFonts w:asciiTheme="majorHAnsi" w:hAnsiTheme="majorHAnsi" w:cstheme="majorHAnsi"/>
         </w:rPr>
-        <w:t>CastFlag</w:t>
+        <w:t>DiscreteSampleFlag</w:t>
       </w:r>
       <w:proofErr w:type="spellEnd"/>
       <w:r>
         <w:rPr>
           <w:rFonts w:asciiTheme="majorHAnsi" w:hAnsiTheme="majorHAnsi" w:cstheme="majorHAnsi"/>
         </w:rPr>
-        <w:t xml:space="preserve">: </w:t>
-      </w:r>
-      <w:r>
-        <w:rPr>
-          <w:rFonts w:asciiTheme="majorHAnsi" w:hAnsiTheme="majorHAnsi" w:cstheme="majorHAnsi"/>
-        </w:rPr>
-        <w:t xml:space="preserve">ROV </w:t>
-      </w:r>
-      <w:proofErr w:type="spellStart"/>
-      <w:r>
-        <w:rPr>
-          <w:rFonts w:asciiTheme="majorHAnsi" w:hAnsiTheme="majorHAnsi" w:cstheme="majorHAnsi"/>
-        </w:rPr>
-        <w:t>sealogExport</w:t>
-      </w:r>
-      <w:proofErr w:type="spellEnd"/>
-      <w:r>
-        <w:rPr>
-          <w:rFonts w:asciiTheme="majorHAnsi" w:hAnsiTheme="majorHAnsi" w:cstheme="majorHAnsi"/>
-        </w:rPr>
-        <w:t xml:space="preserve"> file included corrupt </w:t>
-      </w:r>
-      <w:proofErr w:type="spellStart"/>
-      <w:r>
-        <w:rPr>
-          <w:rFonts w:asciiTheme="majorHAnsi" w:hAnsiTheme="majorHAnsi" w:cstheme="majorHAnsi"/>
-        </w:rPr>
-        <w:t>lat</w:t>
-      </w:r>
-      <w:proofErr w:type="spellEnd"/>
-      <w:r>
-        <w:rPr>
-          <w:rFonts w:asciiTheme="majorHAnsi" w:hAnsiTheme="majorHAnsi" w:cstheme="majorHAnsi"/>
-        </w:rPr>
-        <w:t>/long</w:t>
-      </w:r>
-      <w:r>
-        <w:rPr>
-          <w:rFonts w:asciiTheme="majorHAnsi" w:hAnsiTheme="majorHAnsi" w:cstheme="majorHAnsi"/>
-        </w:rPr>
-        <w:t xml:space="preserve">, </w:t>
-      </w:r>
-      <w:proofErr w:type="spellStart"/>
-      <w:r>
-        <w:rPr>
-          <w:rFonts w:asciiTheme="majorHAnsi" w:hAnsiTheme="majorHAnsi" w:cstheme="majorHAnsi"/>
-        </w:rPr>
-        <w:t>DiscreteSampleFlag</w:t>
-      </w:r>
-      <w:proofErr w:type="spellEnd"/>
-      <w:r>
-        <w:rPr>
-          <w:rFonts w:asciiTheme="majorHAnsi" w:hAnsiTheme="majorHAnsi" w:cstheme="majorHAnsi"/>
-        </w:rPr>
-        <w:t>: Oxygen pickled with 1.5 mL of NaOH</w:t>
+        <w:t>: Chlorophyll filtration leaked a little</w:t>
       </w:r>
     </w:p>
     <w:p>
@@ -2115,7 +1968,7 @@
         <w:rPr>
           <w:rFonts w:asciiTheme="majorHAnsi" w:hAnsiTheme="majorHAnsi" w:cstheme="majorHAnsi"/>
         </w:rPr>
-        <w:t xml:space="preserve">AT50-29, CTD-002, </w:t>
+        <w:t xml:space="preserve">AT50-29, J2-1612, </w:t>
       </w:r>
       <w:proofErr w:type="spellStart"/>
       <w:r>
@@ -2129,7 +1982,7 @@
         <w:rPr>
           <w:rFonts w:asciiTheme="majorHAnsi" w:hAnsiTheme="majorHAnsi" w:cstheme="majorHAnsi"/>
         </w:rPr>
-        <w:t xml:space="preserve"> 3: </w:t>
+        <w:t xml:space="preserve"> Aft Starboard: </w:t>
       </w:r>
       <w:proofErr w:type="spellStart"/>
       <w:r>
@@ -2143,33 +1996,21 @@
         <w:rPr>
           <w:rFonts w:asciiTheme="majorHAnsi" w:hAnsiTheme="majorHAnsi" w:cstheme="majorHAnsi"/>
         </w:rPr>
-        <w:t xml:space="preserve">: Oxygen pickled with 1.5 mL of NaOH; Chlorophyll samples </w:t>
+        <w:t xml:space="preserve">: </w:t>
       </w:r>
       <w:proofErr w:type="gramStart"/>
       <w:r>
         <w:rPr>
           <w:rFonts w:asciiTheme="majorHAnsi" w:hAnsiTheme="majorHAnsi" w:cstheme="majorHAnsi"/>
         </w:rPr>
-        <w:t>in</w:t>
-      </w:r>
-      <w:r>
-        <w:rPr>
-          <w:rFonts w:asciiTheme="majorHAnsi" w:hAnsiTheme="majorHAnsi" w:cstheme="majorHAnsi"/>
-        </w:rPr>
-        <w:t>c</w:t>
-      </w:r>
-      <w:r>
-        <w:rPr>
-          <w:rFonts w:asciiTheme="majorHAnsi" w:hAnsiTheme="majorHAnsi" w:cstheme="majorHAnsi"/>
-        </w:rPr>
-        <w:t>ludes</w:t>
+        <w:t>12 hour</w:t>
       </w:r>
       <w:proofErr w:type="gramEnd"/>
       <w:r>
         <w:rPr>
           <w:rFonts w:asciiTheme="majorHAnsi" w:hAnsiTheme="majorHAnsi" w:cstheme="majorHAnsi"/>
         </w:rPr>
-        <w:t xml:space="preserve"> 2 filters as 1st leaked a little</w:t>
+        <w:t xml:space="preserve"> delay in freezing Nutrient sample</w:t>
       </w:r>
     </w:p>
     <w:p>
@@ -2184,7 +2025,7 @@
         <w:rPr>
           <w:rFonts w:asciiTheme="majorHAnsi" w:hAnsiTheme="majorHAnsi" w:cstheme="majorHAnsi"/>
         </w:rPr>
-        <w:t xml:space="preserve">AT50-29, CTD-002, </w:t>
+        <w:t xml:space="preserve">AT50-29, CTD-004, </w:t>
       </w:r>
       <w:proofErr w:type="spellStart"/>
       <w:r>
@@ -2212,8 +2053,16 @@
         <w:rPr>
           <w:rFonts w:asciiTheme="majorHAnsi" w:hAnsiTheme="majorHAnsi" w:cstheme="majorHAnsi"/>
         </w:rPr>
-        <w:t>: Oxygen pickled with 1.5 mL of NaOH</w:t>
-      </w:r>
+        <w:t xml:space="preserve">: DIC sample possibly taken from wrong </w:t>
+      </w:r>
+      <w:proofErr w:type="spellStart"/>
+      <w:r>
+        <w:rPr>
+          <w:rFonts w:asciiTheme="majorHAnsi" w:hAnsiTheme="majorHAnsi" w:cstheme="majorHAnsi"/>
+        </w:rPr>
+        <w:t>Niskin</w:t>
+      </w:r>
+      <w:proofErr w:type="spellEnd"/>
     </w:p>
     <w:p>
       <w:pPr>
@@ -2227,7 +2076,7 @@
         <w:rPr>
           <w:rFonts w:asciiTheme="majorHAnsi" w:hAnsiTheme="majorHAnsi" w:cstheme="majorHAnsi"/>
         </w:rPr>
-        <w:t xml:space="preserve">AT50-29, CTD-002, </w:t>
+        <w:t xml:space="preserve">AT50-29, CTD-004, </w:t>
       </w:r>
       <w:proofErr w:type="spellStart"/>
       <w:r>
@@ -2241,7 +2090,7 @@
         <w:rPr>
           <w:rFonts w:asciiTheme="majorHAnsi" w:hAnsiTheme="majorHAnsi" w:cstheme="majorHAnsi"/>
         </w:rPr>
-        <w:t xml:space="preserve"> 19: </w:t>
+        <w:t xml:space="preserve"> 9: </w:t>
       </w:r>
       <w:proofErr w:type="spellStart"/>
       <w:r>
@@ -2255,8 +2104,16 @@
         <w:rPr>
           <w:rFonts w:asciiTheme="majorHAnsi" w:hAnsiTheme="majorHAnsi" w:cstheme="majorHAnsi"/>
         </w:rPr>
-        <w:t>: Chlorophyll filtration leaked a little</w:t>
-      </w:r>
+        <w:t xml:space="preserve">: DIC sample possibly taken from wrong </w:t>
+      </w:r>
+      <w:proofErr w:type="spellStart"/>
+      <w:r>
+        <w:rPr>
+          <w:rFonts w:asciiTheme="majorHAnsi" w:hAnsiTheme="majorHAnsi" w:cstheme="majorHAnsi"/>
+        </w:rPr>
+        <w:t>Niskin</w:t>
+      </w:r>
+      <w:proofErr w:type="spellEnd"/>
     </w:p>
     <w:p>
       <w:pPr>
@@ -2270,7 +2127,7 @@
         <w:rPr>
           <w:rFonts w:asciiTheme="majorHAnsi" w:hAnsiTheme="majorHAnsi" w:cstheme="majorHAnsi"/>
         </w:rPr>
-        <w:t xml:space="preserve">AT50-29, J2-1612, </w:t>
+        <w:t xml:space="preserve">AT50-29, CTD-004, </w:t>
       </w:r>
       <w:proofErr w:type="spellStart"/>
       <w:r>
@@ -2284,7 +2141,7 @@
         <w:rPr>
           <w:rFonts w:asciiTheme="majorHAnsi" w:hAnsiTheme="majorHAnsi" w:cstheme="majorHAnsi"/>
         </w:rPr>
-        <w:t xml:space="preserve"> Aft Starboard: </w:t>
+        <w:t xml:space="preserve"> 11: </w:t>
       </w:r>
       <w:proofErr w:type="spellStart"/>
       <w:r>
@@ -2298,22 +2155,16 @@
         <w:rPr>
           <w:rFonts w:asciiTheme="majorHAnsi" w:hAnsiTheme="majorHAnsi" w:cstheme="majorHAnsi"/>
         </w:rPr>
-        <w:t xml:space="preserve">: </w:t>
-      </w:r>
-      <w:proofErr w:type="gramStart"/>
-      <w:r>
-        <w:rPr>
-          <w:rFonts w:asciiTheme="majorHAnsi" w:hAnsiTheme="majorHAnsi" w:cstheme="majorHAnsi"/>
-        </w:rPr>
-        <w:t>12 hour</w:t>
-      </w:r>
-      <w:proofErr w:type="gramEnd"/>
-      <w:r>
-        <w:rPr>
-          <w:rFonts w:asciiTheme="majorHAnsi" w:hAnsiTheme="majorHAnsi" w:cstheme="majorHAnsi"/>
-        </w:rPr>
-        <w:t xml:space="preserve"> delay in freezing Nutrient sample</w:t>
-      </w:r>
+        <w:t xml:space="preserve">: DIC sample possibly taken from wrong </w:t>
+      </w:r>
+      <w:proofErr w:type="spellStart"/>
+      <w:r>
+        <w:rPr>
+          <w:rFonts w:asciiTheme="majorHAnsi" w:hAnsiTheme="majorHAnsi" w:cstheme="majorHAnsi"/>
+        </w:rPr>
+        <w:t>Niskin</w:t>
+      </w:r>
+      <w:proofErr w:type="spellEnd"/>
     </w:p>
     <w:p>
       <w:pPr>
@@ -2327,7 +2178,7 @@
         <w:rPr>
           <w:rFonts w:asciiTheme="majorHAnsi" w:hAnsiTheme="majorHAnsi" w:cstheme="majorHAnsi"/>
         </w:rPr>
-        <w:t xml:space="preserve">AT50-29, CTD-004, </w:t>
+        <w:t xml:space="preserve">AT50-29, CTD-005, </w:t>
       </w:r>
       <w:proofErr w:type="spellStart"/>
       <w:r>
@@ -2341,7 +2192,7 @@
         <w:rPr>
           <w:rFonts w:asciiTheme="majorHAnsi" w:hAnsiTheme="majorHAnsi" w:cstheme="majorHAnsi"/>
         </w:rPr>
-        <w:t xml:space="preserve"> 7: </w:t>
+        <w:t xml:space="preserve"> 13: </w:t>
       </w:r>
       <w:proofErr w:type="spellStart"/>
       <w:r>
@@ -2355,16 +2206,8 @@
         <w:rPr>
           <w:rFonts w:asciiTheme="majorHAnsi" w:hAnsiTheme="majorHAnsi" w:cstheme="majorHAnsi"/>
         </w:rPr>
-        <w:t xml:space="preserve">: DIC sample possibly taken from wrong </w:t>
-      </w:r>
-      <w:proofErr w:type="spellStart"/>
-      <w:r>
-        <w:rPr>
-          <w:rFonts w:asciiTheme="majorHAnsi" w:hAnsiTheme="majorHAnsi" w:cstheme="majorHAnsi"/>
-        </w:rPr>
-        <w:t>Niskin</w:t>
-      </w:r>
-      <w:proofErr w:type="spellEnd"/>
+        <w:t>: Oxygen bottle chipped during sampling</w:t>
+      </w:r>
     </w:p>
     <w:p>
       <w:pPr>
@@ -2378,7 +2221,7 @@
         <w:rPr>
           <w:rFonts w:asciiTheme="majorHAnsi" w:hAnsiTheme="majorHAnsi" w:cstheme="majorHAnsi"/>
         </w:rPr>
-        <w:t xml:space="preserve">AT50-29, CTD-004, </w:t>
+        <w:t xml:space="preserve">AT50-29, CTD-006, </w:t>
       </w:r>
       <w:proofErr w:type="spellStart"/>
       <w:r>
@@ -2392,7 +2235,7 @@
         <w:rPr>
           <w:rFonts w:asciiTheme="majorHAnsi" w:hAnsiTheme="majorHAnsi" w:cstheme="majorHAnsi"/>
         </w:rPr>
-        <w:t xml:space="preserve"> 9: </w:t>
+        <w:t xml:space="preserve"> 15: </w:t>
       </w:r>
       <w:proofErr w:type="spellStart"/>
       <w:r>
@@ -2406,16 +2249,8 @@
         <w:rPr>
           <w:rFonts w:asciiTheme="majorHAnsi" w:hAnsiTheme="majorHAnsi" w:cstheme="majorHAnsi"/>
         </w:rPr>
-        <w:t xml:space="preserve">: DIC sample possibly taken from wrong </w:t>
-      </w:r>
-      <w:proofErr w:type="spellStart"/>
-      <w:r>
-        <w:rPr>
-          <w:rFonts w:asciiTheme="majorHAnsi" w:hAnsiTheme="majorHAnsi" w:cstheme="majorHAnsi"/>
-        </w:rPr>
-        <w:t>Niskin</w:t>
-      </w:r>
-      <w:proofErr w:type="spellEnd"/>
+        <w:t>: Chipped Oxygen bottle was used</w:t>
+      </w:r>
     </w:p>
     <w:p>
       <w:pPr>
@@ -2429,7 +2264,7 @@
         <w:rPr>
           <w:rFonts w:asciiTheme="majorHAnsi" w:hAnsiTheme="majorHAnsi" w:cstheme="majorHAnsi"/>
         </w:rPr>
-        <w:t xml:space="preserve">AT50-29, CTD-004, </w:t>
+        <w:t xml:space="preserve">AT50-29, CTD-007, </w:t>
       </w:r>
       <w:proofErr w:type="spellStart"/>
       <w:r>
@@ -2443,7 +2278,7 @@
         <w:rPr>
           <w:rFonts w:asciiTheme="majorHAnsi" w:hAnsiTheme="majorHAnsi" w:cstheme="majorHAnsi"/>
         </w:rPr>
-        <w:t xml:space="preserve"> 11: </w:t>
+        <w:t xml:space="preserve"> 17: </w:t>
       </w:r>
       <w:proofErr w:type="spellStart"/>
       <w:r>
@@ -2457,16 +2292,8 @@
         <w:rPr>
           <w:rFonts w:asciiTheme="majorHAnsi" w:hAnsiTheme="majorHAnsi" w:cstheme="majorHAnsi"/>
         </w:rPr>
-        <w:t xml:space="preserve">: DIC sample possibly taken from wrong </w:t>
-      </w:r>
-      <w:proofErr w:type="spellStart"/>
-      <w:r>
-        <w:rPr>
-          <w:rFonts w:asciiTheme="majorHAnsi" w:hAnsiTheme="majorHAnsi" w:cstheme="majorHAnsi"/>
-        </w:rPr>
-        <w:t>Niskin</w:t>
-      </w:r>
-      <w:proofErr w:type="spellEnd"/>
+        <w:t>: Oxygen titration may have overshot endpoint</w:t>
+      </w:r>
     </w:p>
     <w:p>
       <w:pPr>
@@ -2480,7 +2307,7 @@
         <w:rPr>
           <w:rFonts w:asciiTheme="majorHAnsi" w:hAnsiTheme="majorHAnsi" w:cstheme="majorHAnsi"/>
         </w:rPr>
-        <w:t xml:space="preserve">AT50-29, CTD-005, </w:t>
+        <w:t xml:space="preserve">AT50-29, CTD-007, </w:t>
       </w:r>
       <w:proofErr w:type="spellStart"/>
       <w:r>
@@ -2494,7 +2321,7 @@
         <w:rPr>
           <w:rFonts w:asciiTheme="majorHAnsi" w:hAnsiTheme="majorHAnsi" w:cstheme="majorHAnsi"/>
         </w:rPr>
-        <w:t xml:space="preserve"> 13: </w:t>
+        <w:t xml:space="preserve"> 23: </w:t>
       </w:r>
       <w:proofErr w:type="spellStart"/>
       <w:r>
@@ -2508,7 +2335,7 @@
         <w:rPr>
           <w:rFonts w:asciiTheme="majorHAnsi" w:hAnsiTheme="majorHAnsi" w:cstheme="majorHAnsi"/>
         </w:rPr>
-        <w:t>: Oxygen bottle chipped during sampling</w:t>
+        <w:t>: Chlorophyll filtered less than 500 mL</w:t>
       </w:r>
     </w:p>
     <w:p>
@@ -2523,7 +2350,7 @@
         <w:rPr>
           <w:rFonts w:asciiTheme="majorHAnsi" w:hAnsiTheme="majorHAnsi" w:cstheme="majorHAnsi"/>
         </w:rPr>
-        <w:t xml:space="preserve">AT50-29, CTD-006, </w:t>
+        <w:t xml:space="preserve">AT50-29, J2-1647, </w:t>
       </w:r>
       <w:proofErr w:type="spellStart"/>
       <w:r>
@@ -2537,7 +2364,7 @@
         <w:rPr>
           <w:rFonts w:asciiTheme="majorHAnsi" w:hAnsiTheme="majorHAnsi" w:cstheme="majorHAnsi"/>
         </w:rPr>
-        <w:t xml:space="preserve"> 15: </w:t>
+        <w:t xml:space="preserve"> Aft Starboard: </w:t>
       </w:r>
       <w:proofErr w:type="spellStart"/>
       <w:r>
@@ -2551,7 +2378,7 @@
         <w:rPr>
           <w:rFonts w:asciiTheme="majorHAnsi" w:hAnsiTheme="majorHAnsi" w:cstheme="majorHAnsi"/>
         </w:rPr>
-        <w:t>: Chipped Oxygen bottle was used</w:t>
+        <w:t>: Chlorophyll filtered less than 500 mL (vial 5077)</w:t>
       </w:r>
     </w:p>
     <w:p>
@@ -2566,35 +2393,7 @@
         <w:rPr>
           <w:rFonts w:asciiTheme="majorHAnsi" w:hAnsiTheme="majorHAnsi" w:cstheme="majorHAnsi"/>
         </w:rPr>
-        <w:t xml:space="preserve">AT50-29, CTD-007, </w:t>
-      </w:r>
-      <w:proofErr w:type="spellStart"/>
-      <w:r>
-        <w:rPr>
-          <w:rFonts w:asciiTheme="majorHAnsi" w:hAnsiTheme="majorHAnsi" w:cstheme="majorHAnsi"/>
-        </w:rPr>
-        <w:t>Niskin</w:t>
-      </w:r>
-      <w:proofErr w:type="spellEnd"/>
-      <w:r>
-        <w:rPr>
-          <w:rFonts w:asciiTheme="majorHAnsi" w:hAnsiTheme="majorHAnsi" w:cstheme="majorHAnsi"/>
-        </w:rPr>
-        <w:t xml:space="preserve"> 17: </w:t>
-      </w:r>
-      <w:proofErr w:type="spellStart"/>
-      <w:r>
-        <w:rPr>
-          <w:rFonts w:asciiTheme="majorHAnsi" w:hAnsiTheme="majorHAnsi" w:cstheme="majorHAnsi"/>
-        </w:rPr>
-        <w:t>DiscreteSampleFlag</w:t>
-      </w:r>
-      <w:proofErr w:type="spellEnd"/>
-      <w:r>
-        <w:rPr>
-          <w:rFonts w:asciiTheme="majorHAnsi" w:hAnsiTheme="majorHAnsi" w:cstheme="majorHAnsi"/>
-        </w:rPr>
-        <w:t>: Oxygen titration may have overshot endpoint</w:t>
+        <w:t>AT50-29, CTD-008: Cast aborted due to issue with ship’s wire</w:t>
       </w:r>
     </w:p>
     <w:p>
@@ -2609,78 +2408,7 @@
         <w:rPr>
           <w:rFonts w:asciiTheme="majorHAnsi" w:hAnsiTheme="majorHAnsi" w:cstheme="majorHAnsi"/>
         </w:rPr>
-        <w:t xml:space="preserve">AT50-29, CTD-007, </w:t>
-      </w:r>
-      <w:proofErr w:type="spellStart"/>
-      <w:r>
-        <w:rPr>
-          <w:rFonts w:asciiTheme="majorHAnsi" w:hAnsiTheme="majorHAnsi" w:cstheme="majorHAnsi"/>
-        </w:rPr>
-        <w:t>Niskin</w:t>
-      </w:r>
-      <w:proofErr w:type="spellEnd"/>
-      <w:r>
-        <w:rPr>
-          <w:rFonts w:asciiTheme="majorHAnsi" w:hAnsiTheme="majorHAnsi" w:cstheme="majorHAnsi"/>
-        </w:rPr>
-        <w:t xml:space="preserve"> 23: </w:t>
-      </w:r>
-      <w:proofErr w:type="spellStart"/>
-      <w:r>
-        <w:rPr>
-          <w:rFonts w:asciiTheme="majorHAnsi" w:hAnsiTheme="majorHAnsi" w:cstheme="majorHAnsi"/>
-        </w:rPr>
-        <w:t>DiscreteSampleFlag</w:t>
-      </w:r>
-      <w:proofErr w:type="spellEnd"/>
-      <w:r>
-        <w:rPr>
-          <w:rFonts w:asciiTheme="majorHAnsi" w:hAnsiTheme="majorHAnsi" w:cstheme="majorHAnsi"/>
-        </w:rPr>
-        <w:t>: Chlorophyll filtered less than 500 mL</w:t>
-      </w:r>
-    </w:p>
-    <w:p>
-      <w:pPr>
-        <w:adjustRightInd w:val="0"/>
-        <w:contextualSpacing/>
-        <w:rPr>
-          <w:rFonts w:asciiTheme="majorHAnsi" w:hAnsiTheme="majorHAnsi" w:cstheme="majorHAnsi"/>
-        </w:rPr>
-      </w:pPr>
-      <w:r>
-        <w:rPr>
-          <w:rFonts w:asciiTheme="majorHAnsi" w:hAnsiTheme="majorHAnsi" w:cstheme="majorHAnsi"/>
-        </w:rPr>
-        <w:t xml:space="preserve">AT50-29, J2-1647, </w:t>
-      </w:r>
-      <w:proofErr w:type="spellStart"/>
-      <w:r>
-        <w:rPr>
-          <w:rFonts w:asciiTheme="majorHAnsi" w:hAnsiTheme="majorHAnsi" w:cstheme="majorHAnsi"/>
-        </w:rPr>
-        <w:t>Niskin</w:t>
-      </w:r>
-      <w:proofErr w:type="spellEnd"/>
-      <w:r>
-        <w:rPr>
-          <w:rFonts w:asciiTheme="majorHAnsi" w:hAnsiTheme="majorHAnsi" w:cstheme="majorHAnsi"/>
-        </w:rPr>
-        <w:t xml:space="preserve"> Aft Starboard: </w:t>
-      </w:r>
-      <w:proofErr w:type="spellStart"/>
-      <w:r>
-        <w:rPr>
-          <w:rFonts w:asciiTheme="majorHAnsi" w:hAnsiTheme="majorHAnsi" w:cstheme="majorHAnsi"/>
-        </w:rPr>
-        <w:t>DiscreteSampleFlag</w:t>
-      </w:r>
-      <w:proofErr w:type="spellEnd"/>
-      <w:r>
-        <w:rPr>
-          <w:rFonts w:asciiTheme="majorHAnsi" w:hAnsiTheme="majorHAnsi" w:cstheme="majorHAnsi"/>
-        </w:rPr>
-        <w:t>: Chlorophyll filtered less than 500 mL (vial 5077)</w:t>
+        <w:t>AT50-29, CTD-009: Cast failed due to loss of communication to rosette</w:t>
       </w:r>
     </w:p>
     <w:p>
@@ -6009,7 +5737,6 @@
               <w:bottom w:val="nil"/>
               <w:right w:val="nil"/>
             </w:tcBorders>
-            <w:shd w:val="clear" w:color="auto" w:fill="auto"/>
             <w:noWrap/>
             <w:vAlign w:val="bottom"/>
           </w:tcPr>
@@ -6034,7 +5761,6 @@
               <w:bottom w:val="nil"/>
               <w:right w:val="nil"/>
             </w:tcBorders>
-            <w:shd w:val="clear" w:color="auto" w:fill="auto"/>
             <w:noWrap/>
             <w:vAlign w:val="bottom"/>
           </w:tcPr>

</xml_diff>